<commit_message>
docs(A2): reframe as solo submission after teammate withdrawal
Cameron Bruce (allocated teammate) advised on 24 June 2026 that he is
dropping IFQ636 and withdrew before submission; an earlier-allocated
member (Juha Anttila) had also not contributed. All assignment work was
completed solo by David Carver.

- Report S4.1/S4.2: state solo status factually; reframe the GitHub
  feature-branch / PR / merge-conflict workflow as an individual
  demonstration rather than team collaboration; cover lines updated.
- Meeting log -> solo development log (Contributor: David Carver).
- Part C and Declaration of Contribution: David = sole contributor;
  Cameron/Juha recorded as allocated-but-non-contributing; signature
  blocks updated.
- Add coordinator notification email draft (team change).

Co-Authored-By: Claude Opus 4.8 <noreply@anthropic.com>
Claude-Session: https://claude.ai/code/session_018qvo2YYVSdyAShj3w4tzaz
</commit_message>
<xml_diff>
--- a/docs/A2/IFQ636_A2_Declaration_of_Contribution_FILLED.docx
+++ b/docs/A2/IFQ636_A2_Declaration_of_Contribution_FILLED.docx
@@ -187,7 +187,7 @@
           </w:tcPr>
           <w:p>
             <w:r>
-              <w:t>Selected and provided the Assignment 1 project (Mesa Restaurant Review Platform); re-architected the backend into a layered object-oriented design and implemented eight design patterns (Singleton, Factory Method, Builder, Repository, Decorator, Facade, Strategy, Observer); built the new in-app Notifications subsystem (model, factory, observer, service, controller, routes and React bell); wrote and expanded the Mocha/Sinon unit tests; configured MongoDB Atlas, the GitHub Actions CI/CD pipeline and deployment; set up the GitHub repository and branching; compiled the report.</w:t>
+              <w:t>Sole contributor — completed all work in this submission: selected and provided the Assignment 1 project (Mesa); re-architected the backend into a layered object-oriented design with eight design patterns (Singleton, Factory Method, Builder, Repository, Decorator, Facade, Strategy, Observer); built the new in-app Notifications subsystem; wrote all Mocha/Sinon unit tests (49 passing); performed the Postman/API testing; configured MongoDB Atlas, the GitHub Actions CI/CD pipeline (self-hosted runner on EC2 with nginx + pm2) and deployment; set up the GitHub repository, branching and merge-conflict resolution; and compiled the report.</w:t>
             </w:r>
           </w:p>
         </w:tc>
@@ -219,7 +219,7 @@
           </w:tcPr>
           <w:p>
             <w:r>
-              <w:t>Contributed to unit testing and the test-case matrix, API testing with Postman, project documentation, code review of pull requests, and merge-conflict resolution during integration. [Adjust to reflect Cameron’s actual contribution.]</w:t>
+              <w:t>Allocated to the team and added as a GitHub collaborator. Advised on 24 June 2026 that he is dropping IFQ636 and withdrew before the final submission. Did not contribute to the delivered work.</w:t>
             </w:r>
           </w:p>
         </w:tc>
@@ -327,25 +327,7 @@
         </w:rPr>
       </w:pPr>
       <w:r>
-        <w:rPr>
-          <w:rFonts w:asciiTheme="minorHAnsi" w:hAnsiTheme="minorHAnsi" w:cstheme="minorHAnsi"/>
-          <w:color w:val="auto"/>
-        </w:rPr>
-        <w:t>We declare that the information provided above accurately reflects the contribution of each team member</w:t>
-      </w:r>
-      <w:r>
-        <w:rPr>
-          <w:rFonts w:asciiTheme="minorHAnsi" w:hAnsiTheme="minorHAnsi" w:cstheme="minorHAnsi"/>
-          <w:color w:val="auto"/>
-        </w:rPr>
-        <w:t xml:space="preserve">. </w:t>
-      </w:r>
-      <w:r>
-        <w:rPr>
-          <w:rFonts w:asciiTheme="minorHAnsi" w:hAnsiTheme="minorHAnsi" w:cstheme="minorHAnsi"/>
-          <w:color w:val="auto"/>
-        </w:rPr>
-        <w:t>Each listed student has made a substantial contribution to the project in accordance with unit requirements.</w:t>
+        <w:t>I declare that the information provided above accurately reflects the contribution to the project. This is a solo submission by David (Anrio) Carver; the allocated teammates listed did not contribute, as described above.</w:t>
       </w:r>
     </w:p>
     <w:p>
@@ -575,17 +557,13 @@
           <w:tcPr>
             <w:tcW w:w="3006" w:type="dxa"/>
           </w:tcPr>
-          <w:p>
-            <w:r/>
-          </w:p>
+          <w:p/>
         </w:tc>
         <w:tc>
           <w:tcPr>
             <w:tcW w:w="3005" w:type="dxa"/>
           </w:tcPr>
-          <w:p>
-            <w:r/>
-          </w:p>
+          <w:p/>
         </w:tc>
       </w:tr>
       <w:tr>
@@ -604,7 +582,9 @@
             <w:tcW w:w="3006" w:type="dxa"/>
           </w:tcPr>
           <w:p>
-            <w:r/>
+            <w:r>
+              <w:t>Withdrew from unit — did not contribute</w:t>
+            </w:r>
           </w:p>
         </w:tc>
         <w:tc>
@@ -612,7 +592,9 @@
             <w:tcW w:w="3005" w:type="dxa"/>
           </w:tcPr>
           <w:p>
-            <w:r/>
+            <w:r>
+              <w:t>24/06/2026</w:t>
+            </w:r>
           </w:p>
         </w:tc>
       </w:tr>

</xml_diff>